<commit_message>
fix: account refunds in paid total and prepaid nights; offer refund form print after refund
Co-authored-by: Cursor <cursoragent@cursor.com>
</commit_message>
<xml_diff>
--- a/templates/guest-forms/refund-form.docx
+++ b/templates/guest-forms/refund-form.docx
@@ -615,6 +615,134 @@
                 <w:sz w:val="20"/>
                 <w:szCs w:val="20"/>
               </w:rPr>
+              <w:t xml:space="preserve">Ночей к возврату</w:t>
+            </w:r>
+          </w:p>
+        </w:tc>
+        <w:tc>
+          <w:tcPr>
+            <w:tcBorders>
+              <w:top w:val="single" w:color="999999" w:sz="1"/>
+              <w:left w:val="single" w:color="999999" w:sz="1"/>
+              <w:bottom w:val="single" w:color="999999" w:sz="1"/>
+              <w:right w:val="single" w:color="999999" w:sz="1"/>
+            </w:tcBorders>
+            <w:tcMar>
+              <w:top w:type="dxa" w:w="60"/>
+              <w:left w:type="dxa" w:w="100"/>
+              <w:bottom w:type="dxa" w:w="60"/>
+              <w:right w:type="dxa" w:w="100"/>
+            </w:tcMar>
+            <w:vAlign w:val="center"/>
+          </w:tcPr>
+          <w:p>
+            <w:pPr>
+              <w:spacing w:after="0" w:before="0" w:line="240"/>
+            </w:pPr>
+            <w:r>
+              <w:rPr>
+                <w:rFonts w:ascii="Times New Roman" w:cs="Times New Roman" w:eastAsia="Times New Roman" w:hAnsi="Times New Roman"/>
+                <w:sz w:val="20"/>
+                <w:szCs w:val="20"/>
+              </w:rPr>
+              <w:t xml:space="preserve">{refund_nights}</w:t>
+            </w:r>
+          </w:p>
+        </w:tc>
+      </w:tr>
+      <w:tr>
+        <w:tc>
+          <w:tcPr>
+            <w:tcBorders>
+              <w:top w:val="single" w:color="999999" w:sz="1"/>
+              <w:left w:val="single" w:color="999999" w:sz="1"/>
+              <w:bottom w:val="single" w:color="999999" w:sz="1"/>
+              <w:right w:val="single" w:color="999999" w:sz="1"/>
+            </w:tcBorders>
+            <w:tcMar>
+              <w:top w:type="dxa" w:w="60"/>
+              <w:left w:type="dxa" w:w="100"/>
+              <w:bottom w:type="dxa" w:w="60"/>
+              <w:right w:type="dxa" w:w="100"/>
+            </w:tcMar>
+            <w:vAlign w:val="center"/>
+          </w:tcPr>
+          <w:p>
+            <w:pPr>
+              <w:spacing w:after="0" w:before="0" w:line="240"/>
+            </w:pPr>
+            <w:r>
+              <w:rPr>
+                <w:rFonts w:ascii="Times New Roman" w:cs="Times New Roman" w:eastAsia="Times New Roman" w:hAnsi="Times New Roman"/>
+                <w:b/>
+                <w:bCs/>
+                <w:sz w:val="20"/>
+                <w:szCs w:val="20"/>
+              </w:rPr>
+              <w:t xml:space="preserve">Способ возврата</w:t>
+            </w:r>
+          </w:p>
+        </w:tc>
+        <w:tc>
+          <w:tcPr>
+            <w:tcBorders>
+              <w:top w:val="single" w:color="999999" w:sz="1"/>
+              <w:left w:val="single" w:color="999999" w:sz="1"/>
+              <w:bottom w:val="single" w:color="999999" w:sz="1"/>
+              <w:right w:val="single" w:color="999999" w:sz="1"/>
+            </w:tcBorders>
+            <w:tcMar>
+              <w:top w:type="dxa" w:w="60"/>
+              <w:left w:type="dxa" w:w="100"/>
+              <w:bottom w:type="dxa" w:w="60"/>
+              <w:right w:type="dxa" w:w="100"/>
+            </w:tcMar>
+            <w:vAlign w:val="center"/>
+          </w:tcPr>
+          <w:p>
+            <w:pPr>
+              <w:spacing w:after="0" w:before="0" w:line="240"/>
+            </w:pPr>
+            <w:r>
+              <w:rPr>
+                <w:rFonts w:ascii="Times New Roman" w:cs="Times New Roman" w:eastAsia="Times New Roman" w:hAnsi="Times New Roman"/>
+                <w:sz w:val="20"/>
+                <w:szCs w:val="20"/>
+              </w:rPr>
+              <w:t xml:space="preserve">{refund_method}</w:t>
+            </w:r>
+          </w:p>
+        </w:tc>
+      </w:tr>
+      <w:tr>
+        <w:tc>
+          <w:tcPr>
+            <w:tcBorders>
+              <w:top w:val="single" w:color="999999" w:sz="1"/>
+              <w:left w:val="single" w:color="999999" w:sz="1"/>
+              <w:bottom w:val="single" w:color="999999" w:sz="1"/>
+              <w:right w:val="single" w:color="999999" w:sz="1"/>
+            </w:tcBorders>
+            <w:tcMar>
+              <w:top w:type="dxa" w:w="60"/>
+              <w:left w:type="dxa" w:w="100"/>
+              <w:bottom w:type="dxa" w:w="60"/>
+              <w:right w:type="dxa" w:w="100"/>
+            </w:tcMar>
+            <w:vAlign w:val="center"/>
+          </w:tcPr>
+          <w:p>
+            <w:pPr>
+              <w:spacing w:after="0" w:before="0" w:line="240"/>
+            </w:pPr>
+            <w:r>
+              <w:rPr>
+                <w:rFonts w:ascii="Times New Roman" w:cs="Times New Roman" w:eastAsia="Times New Roman" w:hAnsi="Times New Roman"/>
+                <w:b/>
+                <w:bCs/>
+                <w:sz w:val="20"/>
+                <w:szCs w:val="20"/>
+              </w:rPr>
               <w:t xml:space="preserve">Реквизиты для возврата</w:t>
             </w:r>
           </w:p>
@@ -663,7 +791,7 @@
           <w:sz w:val="20"/>
           <w:szCs w:val="20"/>
         </w:rPr>
-        <w:t xml:space="preserve">Сумма к возврату (заполняет администрация): </w:t>
+        <w:t xml:space="preserve">Сумма к возврату: </w:t>
       </w:r>
       <w:r>
         <w:rPr>
@@ -671,7 +799,7 @@
           <w:sz w:val="20"/>
           <w:szCs w:val="20"/>
         </w:rPr>
-        <w:t xml:space="preserve">____________________ руб.</w:t>
+        <w:t xml:space="preserve">{refund_amount}</w:t>
       </w:r>
     </w:p>
     <w:tbl>

</xml_diff>